<commit_message>
[revision] gen_word_full.py 彻底重写 + 图表原地插入修复 + audit_manuscript.py 新建 | 383KB/3图/35引用
</commit_message>
<xml_diff>
--- a/manuscript/NRDS_LifeCourse_Review.docx
+++ b/manuscript/NRDS_LifeCourse_Review.docx
@@ -49,11 +49,9 @@
         <w:rPr>
           <w:rFonts w:ascii="Times New Roman" w:hAnsi="Times New Roman"/>
           <w:b/>
-          <w:sz w:val="40"/>
+          <w:sz w:val="36"/>
         </w:rPr>
-        <w:t>Mechanisms of Immunotherapy Resistance in</w:t>
-        <w:br/>
-        <w:t>Squamous Cell Carcinoma of Non-Small Cell Lung Cancer</w:t>
+        <w:t>Life-Course Consequences of Early-Life Respiratory Interventions for Neonatal Respiratory Distress Syndrome: A Narrative Review</w:t>
       </w:r>
     </w:p>
     <w:p>
@@ -81,7 +79,7 @@
           <w:i/>
           <w:sz w:val="28"/>
         </w:rPr>
-        <w:t>Review Article</w:t>
+        <w:t>Narrative Review</w:t>
       </w:r>
     </w:p>
     <w:p>
@@ -122,7 +120,7 @@
           <w:rFonts w:ascii="Times New Roman" w:hAnsi="Times New Roman"/>
           <w:sz w:val="24"/>
         </w:rPr>
-        <w:t>Immunotherapy Resistance in Lung Squamous Cell Carcinoma</w:t>
+        <w:t>Life-Course Consequences of Early-Life Respiratory Interventions for N</w:t>
       </w:r>
     </w:p>
     <w:p>
@@ -150,7 +148,7 @@
           <w:rFonts w:ascii="Times New Roman" w:hAnsi="Times New Roman"/>
           <w:sz w:val="24"/>
         </w:rPr>
-        <w:t>~9,000 (main text); 246 (abstract)</w:t>
+        <w:t>~8,772 words (body); ~9,572 including references</w:t>
       </w:r>
     </w:p>
     <w:p>
@@ -178,7 +176,7 @@
           <w:rFonts w:ascii="Times New Roman" w:hAnsi="Times New Roman"/>
           <w:sz w:val="24"/>
         </w:rPr>
-        <w:t>1 Figure | 2 Tables | 41 References</w:t>
+        <w:t>2 Figure(s) | 1 Table(s) | 35 References</w:t>
       </w:r>
     </w:p>
     <w:p>
@@ -199,14 +197,14 @@
           <w:b/>
           <w:sz w:val="24"/>
         </w:rPr>
-        <w:t xml:space="preserve">Keywords: </w:t>
+        <w:t xml:space="preserve">Target Journal: </w:t>
       </w:r>
       <w:r>
         <w:rPr>
           <w:rFonts w:ascii="Times New Roman" w:hAnsi="Times New Roman"/>
           <w:sz w:val="24"/>
         </w:rPr>
-        <w:t>lung squamous cell carcinoma; immunotherapy resistance; immune checkpoint inhibitors; tumor microenvironment; T cell exhaustion; KEAP1/NRF2</w:t>
+        <w:t>Pediatric Research</w:t>
       </w:r>
     </w:p>
     <w:p>
@@ -242,6 +240,59 @@
     </w:p>
     <w:p>
       <w:pPr>
+        <w:spacing w:line="480" w:lineRule="auto"/>
+      </w:pPr>
+      <w:r>
+        <w:rPr>
+          <w:rFonts w:ascii="Times New Roman" w:hAnsi="Times New Roman"/>
+          <w:b w:val="0"/>
+          <w:i w:val="0"/>
+          <w:sz w:val="24"/>
+        </w:rPr>
+      </w:r>
+    </w:p>
+    <w:p>
+      <w:pPr>
+        <w:spacing w:line="480" w:lineRule="auto"/>
+      </w:pPr>
+      <w:r>
+        <w:rPr>
+          <w:rFonts w:ascii="Times New Roman" w:hAnsi="Times New Roman"/>
+          <w:b w:val="0"/>
+          <w:i w:val="0"/>
+          <w:sz w:val="24"/>
+        </w:rPr>
+      </w:r>
+      <w:r>
+        <w:rPr>
+          <w:rFonts w:ascii="Times New Roman" w:hAnsi="Times New Roman"/>
+          <w:b/>
+          <w:sz w:val="24"/>
+        </w:rPr>
+        <w:t xml:space="preserve">Impact Statement: </w:t>
+      </w:r>
+    </w:p>
+    <w:p>
+      <w:pPr>
+        <w:spacing w:line="480" w:lineRule="auto"/>
+      </w:pPr>
+      <w:r>
+        <w:rPr>
+          <w:rFonts w:ascii="Times New Roman" w:hAnsi="Times New Roman"/>
+          <w:b w:val="0"/>
+          <w:i w:val="0"/>
+          <w:sz w:val="24"/>
+        </w:rPr>
+        <w:t>This narrative review synthesizes evidence from 590 papers on the long-term consequences of neonatal respiratory interventions for respiratory distress syndrome. We find high-certainty evidence for short-term benefits of antenatal corticosteroids, volume-targeted ventilation, and less invasive surfactant administration, but near-total absence of data on outcomes beyond 18-36 months of age. Quality of life, adult pulmonary function, and functional outcomes are essentially unstudied. The review identifies critical knowledge gaps and proposes a research agenda centered on lifelong follow-up and patient-reported outcome measures. ---</w:t>
+      </w:r>
+    </w:p>
+    <w:p>
+      <w:r>
+        <w:br w:type="page"/>
+      </w:r>
+    </w:p>
+    <w:p>
+      <w:pPr>
         <w:pStyle w:val="Heading1"/>
       </w:pPr>
       <w:r>
@@ -319,7 +370,85 @@
           <w:i w:val="0"/>
           <w:sz w:val="24"/>
         </w:rPr>
-        <w:t>The existing evidence synthesis landscape is both rich and fragmented. The Cochrane Neonatal Group has produced systematic reviews covering antenatal corticosteroids [3], postnatal corticosteroids [12–15], ventilation strategies [5], surfactant preparations [16], and oxygen saturation targets [17]. These reviews provide high-certainty evidence for short-term outcomes — death, BPD, intraventricular hemorrhage, patent ductus arteriosus — but their long-term follow-up data, where available, are typically limited to neurodevelopmental assessment at 18–24 months corrected age. Pulmonary function, cognitive performance, educational attainment, and quality of life in later childhood and adulthood are rarely reported, and when reported, are based on small subsets of the original trial populations [18].</w:t>
+        <w:t>The existing evidence synthesis landscape is both rich and fragmented. The Cochrane Neonatal Group has produced systematic reviews covering antenatal corticosteroids [3], postnatal corticosteroids [12–15], ventilation strategies [5], surfactant preparations [16], and oxygen saturation targets [17]. The conceptual framework organizing this review is shown in Figure 1: NICU interventions acting through BPD to shape health trajectories across the life course, with the thickness of the evidence base diminishing sharply beyond the preschool years. These reviews provide high-certainty evidence for short-term outcomes — death, BPD, intraventricular hemorrhage, patent ductus arteriosus — but their long-term follow-up data, where available, are typically limited to neurodevelopmental assessment at 18–24 months corrected age. Pulmonary function, cognitive performance, educational attainment, and quality of life in later childhood and adulthood are rarely reported, and when reported, are based on small subsets of the original trial populations [18].</w:t>
+      </w:r>
+    </w:p>
+    <w:p>
+      <w:pPr>
+        <w:spacing w:line="480" w:lineRule="auto"/>
+      </w:pPr>
+      <w:r>
+        <w:rPr>
+          <w:rFonts w:ascii="Times New Roman" w:hAnsi="Times New Roman"/>
+          <w:b w:val="0"/>
+          <w:i w:val="0"/>
+          <w:sz w:val="24"/>
+        </w:rPr>
+      </w:r>
+    </w:p>
+    <w:p>
+      <w:pPr>
+        <w:jc w:val="center"/>
+      </w:pPr>
+      <w:r>
+        <w:drawing>
+          <wp:inline xmlns:a="http://schemas.openxmlformats.org/drawingml/2006/main" xmlns:pic="http://schemas.openxmlformats.org/drawingml/2006/picture">
+            <wp:extent cx="5303520" cy="3162281"/>
+            <wp:docPr id="1" name="Picture 1"/>
+            <wp:cNvGraphicFramePr>
+              <a:graphicFrameLocks noChangeAspect="1"/>
+            </wp:cNvGraphicFramePr>
+            <a:graphic>
+              <a:graphicData uri="http://schemas.openxmlformats.org/drawingml/2006/picture">
+                <pic:pic>
+                  <pic:nvPicPr>
+                    <pic:cNvPr id="0" name="Figure1_Framework.png"/>
+                    <pic:cNvPicPr/>
+                  </pic:nvPicPr>
+                  <pic:blipFill>
+                    <a:blip r:embed="rId9"/>
+                    <a:stretch>
+                      <a:fillRect/>
+                    </a:stretch>
+                  </pic:blipFill>
+                  <pic:spPr>
+                    <a:xfrm>
+                      <a:off x="0" y="0"/>
+                      <a:ext cx="5303520" cy="3162281"/>
+                    </a:xfrm>
+                    <a:prstGeom prst="rect"/>
+                  </pic:spPr>
+                </pic:pic>
+              </a:graphicData>
+            </a:graphic>
+          </wp:inline>
+        </w:drawing>
+      </w:r>
+    </w:p>
+    <w:p>
+      <w:pPr>
+        <w:jc w:val="center"/>
+      </w:pPr>
+      <w:r>
+        <w:rPr>
+          <w:rFonts w:ascii="Times New Roman" w:hAnsi="Times New Roman"/>
+          <w:b/>
+          <w:sz w:val="20"/>
+        </w:rPr>
+        <w:t>Figure 1. Life-Course Framework of NRDS Interventions.** NICU interventions affect outcomes across the life course, with BPD as a central mediator. Evidence is strong for short-term outcomes (green) but absent for long-term outcomes beyond 2-5 years (red).</w:t>
+      </w:r>
+    </w:p>
+    <w:p>
+      <w:pPr>
+        <w:spacing w:line="480" w:lineRule="auto"/>
+      </w:pPr>
+      <w:r>
+        <w:rPr>
+          <w:rFonts w:ascii="Times New Roman" w:hAnsi="Times New Roman"/>
+          <w:b w:val="0"/>
+          <w:i w:val="0"/>
+          <w:sz w:val="24"/>
+        </w:rPr>
       </w:r>
     </w:p>
     <w:p>
@@ -338,33 +467,6 @@
     </w:p>
     <w:p>
       <w:pPr>
-        <w:spacing w:line="480" w:lineRule="auto"/>
-      </w:pPr>
-      <w:r>
-        <w:rPr>
-          <w:rFonts w:ascii="Times New Roman" w:hAnsi="Times New Roman"/>
-          <w:b w:val="0"/>
-          <w:i w:val="0"/>
-          <w:sz w:val="20"/>
-        </w:rPr>
-        <w:t>[Missing: Figure2_Framework.png]</w:t>
-      </w:r>
-    </w:p>
-    <w:p>
-      <w:pPr>
-        <w:spacing w:line="480" w:lineRule="auto"/>
-      </w:pPr>
-      <w:r>
-        <w:rPr>
-          <w:rFonts w:ascii="Times New Roman" w:hAnsi="Times New Roman"/>
-          <w:b w:val="0"/>
-          <w:i w:val="0"/>
-          <w:sz w:val="24"/>
-        </w:rPr>
-      </w:r>
-    </w:p>
-    <w:p>
-      <w:pPr>
         <w:pStyle w:val="Heading1"/>
       </w:pPr>
       <w:r>
@@ -563,34 +665,6 @@
     </w:p>
     <w:p>
       <w:pPr>
-        <w:spacing w:line="480" w:lineRule="auto"/>
-      </w:pPr>
-      <w:r>
-        <w:rPr>
-          <w:rFonts w:ascii="Times New Roman" w:hAnsi="Times New Roman"/>
-          <w:b w:val="0"/>
-          <w:i w:val="0"/>
-          <w:sz w:val="24"/>
-        </w:rPr>
-        <w:t>Summary of ACS evidence:</w:t>
-      </w:r>
-    </w:p>
-    <w:p>
-      <w:pPr>
-        <w:spacing w:line="480" w:lineRule="auto"/>
-      </w:pPr>
-      <w:r>
-        <w:rPr>
-          <w:rFonts w:ascii="Times New Roman" w:hAnsi="Times New Roman"/>
-          <w:b w:val="0"/>
-          <w:i w:val="0"/>
-          <w:sz w:val="24"/>
-        </w:rPr>
-        <w:t>| Outcome domain | Time horizon | Evidence certainty | Key finding | |---------------|-------------|-------------------|-------------| | Neonatal death, RDS, IVH, NEC | Neonatal | HIGH (Cochrane) | ACS reduces all four outcomes | | Neurodevelopment | 2–5 years | MODERATE | No detectable harm from single course | | Neurodevelopment | School age–adult | LOW | Insufficient data | | Repeat courses | Neonatal | MODERATE | Reduced RDS, lower birth weight; long-term unknown | | Late preterm ACS | Neonatal | MODERATE | Reduced respiratory morbidity, increased hypoglycemia | | Adult lung function, cardiometabolic | Adult | VERY LOW | Essentially no data |</w:t>
-      </w:r>
-    </w:p>
-    <w:p>
-      <w:pPr>
         <w:pStyle w:val="Heading1"/>
       </w:pPr>
       <w:r>
@@ -819,34 +893,6 @@
     </w:p>
     <w:p>
       <w:pPr>
-        <w:spacing w:line="480" w:lineRule="auto"/>
-      </w:pPr>
-      <w:r>
-        <w:rPr>
-          <w:rFonts w:ascii="Times New Roman" w:hAnsi="Times New Roman"/>
-          <w:b w:val="0"/>
-          <w:i w:val="0"/>
-          <w:sz w:val="24"/>
-        </w:rPr>
-        <w:t>Summary of postnatal corticosteroid evidence:</w:t>
-      </w:r>
-    </w:p>
-    <w:p>
-      <w:pPr>
-        <w:spacing w:line="480" w:lineRule="auto"/>
-      </w:pPr>
-      <w:r>
-        <w:rPr>
-          <w:rFonts w:ascii="Times New Roman" w:hAnsi="Times New Roman"/>
-          <w:b w:val="0"/>
-          <w:i w:val="0"/>
-          <w:sz w:val="24"/>
-        </w:rPr>
-        <w:t>| Regimen | BPD reduction | Cerebral palsy risk | Long-term data | |---------|:---:|:---:|------| | Early dexamethasone (&lt; 8 d) | RR 0.72 | RR 1.42 (significant) | 18–24 mo Bayley | | Late dexamethasone (≥ 7 d) | RR 0.80 | RR 1.12 (n.s.) | 18–24 mo Bayley | | Hydrocortisone (any timing) | RR 0.86 | Lower than dexamethasone | Limited | | Inhaled (early) | RR 0.76 | Unknown | Essentially none | | Inhaled (late) | RR 0.90 | Unknown | Essentially none | | School-age IQ, FEV₁, adult QoL | — | — | Not reported for any regimen |</w:t>
-      </w:r>
-    </w:p>
-    <w:p>
-      <w:pPr>
         <w:pStyle w:val="Heading1"/>
       </w:pPr>
       <w:r>
@@ -1233,34 +1279,6 @@
     </w:p>
     <w:p>
       <w:pPr>
-        <w:spacing w:line="480" w:lineRule="auto"/>
-      </w:pPr>
-      <w:r>
-        <w:rPr>
-          <w:rFonts w:ascii="Times New Roman" w:hAnsi="Times New Roman"/>
-          <w:b w:val="0"/>
-          <w:i w:val="0"/>
-          <w:sz w:val="24"/>
-        </w:rPr>
-        <w:t>Summary of surfactant evidence:</w:t>
-      </w:r>
-    </w:p>
-    <w:p>
-      <w:pPr>
-        <w:spacing w:line="480" w:lineRule="auto"/>
-      </w:pPr>
-      <w:r>
-        <w:rPr>
-          <w:rFonts w:ascii="Times New Roman" w:hAnsi="Times New Roman"/>
-          <w:b w:val="0"/>
-          <w:i w:val="0"/>
-          <w:sz w:val="24"/>
-        </w:rPr>
-        <w:t>| Aspect | Evidence status | Long-term data | |--------|:---:|------| | Animal-derived vs synthetic | Settled | — | | Poractant vs beractant | Moderate | None | | LISA vs INSURE | Moderate | None beyond 36 wk PMA | | Surfactant + budesonide | Preliminary | None | | Adult outcomes of surfactant era | — | Missed opportunity |</w:t>
-      </w:r>
-    </w:p>
-    <w:p>
-      <w:pPr>
         <w:pStyle w:val="Heading1"/>
       </w:pPr>
       <w:r>
@@ -1393,34 +1411,6 @@
     </w:p>
     <w:p>
       <w:pPr>
-        <w:spacing w:line="480" w:lineRule="auto"/>
-      </w:pPr>
-      <w:r>
-        <w:rPr>
-          <w:rFonts w:ascii="Times New Roman" w:hAnsi="Times New Roman"/>
-          <w:b w:val="0"/>
-          <w:i w:val="0"/>
-          <w:sz w:val="24"/>
-        </w:rPr>
-        <w:t>Summary of oxygen therapy evidence:</w:t>
-      </w:r>
-    </w:p>
-    <w:p>
-      <w:pPr>
-        <w:spacing w:line="480" w:lineRule="auto"/>
-      </w:pPr>
-      <w:r>
-        <w:rPr>
-          <w:rFonts w:ascii="Times New Roman" w:hAnsi="Times New Roman"/>
-          <w:b w:val="0"/>
-          <w:i w:val="0"/>
-          <w:sz w:val="24"/>
-        </w:rPr>
-        <w:t>| Aspect | Evidence strength | Long-term data | |--------|:---:|------| | Low vs high saturation target: mortality | HIGH (Cochrane) | 5-year follow-up | | Low vs high target: neurodevelopment | MODERATE | 2-5 year Bayley | | Optimal intermediate target | LOW (consensus) | None | | Individualized oxygen dosing | Theoretical | None | | School-age lung function, QoL | — | None |</w:t>
-      </w:r>
-    </w:p>
-    <w:p>
-      <w:pPr>
         <w:pStyle w:val="Heading1"/>
       </w:pPr>
       <w:r>
@@ -1892,7 +1882,85 @@
           <w:i w:val="0"/>
           <w:sz w:val="24"/>
         </w:rPr>
-        <w:t>The single most important limitation of the evidence reviewed in this paper is the systematic failure to follow children beyond 18-36 months of age. This limitation is not unique to neonatal research — it reflects structural features of the clinical research enterprise, including short funding cycles, the cost and logistical complexity of long-term follow-up, and the lack of standardized outcome measures that span infancy to adulthood. But its consequences are particularly severe in neonatology, where the interventions under study are applied during a developmental window of extraordinary plasticity and where their effects may take years or decades to manifest.</w:t>
+        <w:t>The single most important limitation of the evidence reviewed in this paper is the systematic failure to follow children beyond 18-36 months of age. This limitation is not unique to neonatal research — it reflects structural features of the clinical research enterprise, including short funding cycles, the cost and logistical complexity of long-term follow-up, and the lack of standardized outcome measures that span infancy to adulthood. But its consequences are particularly severe in neonatology, where the interventions under study are applied during a developmental window of extraordinary plasticity and where their effects may take years or decades to manifest. The evidence gap is striking when visualized: Figure 2 compares the certainty of short-term versus long-term evidence across intervention classes, revealing the near-total collapse of data beyond five years for ventilation and surfactant strategies.</w:t>
+      </w:r>
+    </w:p>
+    <w:p>
+      <w:pPr>
+        <w:spacing w:line="480" w:lineRule="auto"/>
+      </w:pPr>
+      <w:r>
+        <w:rPr>
+          <w:rFonts w:ascii="Times New Roman" w:hAnsi="Times New Roman"/>
+          <w:b w:val="0"/>
+          <w:i w:val="0"/>
+          <w:sz w:val="24"/>
+        </w:rPr>
+      </w:r>
+    </w:p>
+    <w:p>
+      <w:pPr>
+        <w:jc w:val="center"/>
+      </w:pPr>
+      <w:r>
+        <w:drawing>
+          <wp:inline xmlns:a="http://schemas.openxmlformats.org/drawingml/2006/main" xmlns:pic="http://schemas.openxmlformats.org/drawingml/2006/picture">
+            <wp:extent cx="5303520" cy="2878211"/>
+            <wp:docPr id="2" name="Picture 2"/>
+            <wp:cNvGraphicFramePr>
+              <a:graphicFrameLocks noChangeAspect="1"/>
+            </wp:cNvGraphicFramePr>
+            <a:graphic>
+              <a:graphicData uri="http://schemas.openxmlformats.org/drawingml/2006/picture">
+                <pic:pic>
+                  <pic:nvPicPr>
+                    <pic:cNvPr id="0" name="Figure2_EvidenceGap.png"/>
+                    <pic:cNvPicPr/>
+                  </pic:nvPicPr>
+                  <pic:blipFill>
+                    <a:blip r:embed="rId10"/>
+                    <a:stretch>
+                      <a:fillRect/>
+                    </a:stretch>
+                  </pic:blipFill>
+                  <pic:spPr>
+                    <a:xfrm>
+                      <a:off x="0" y="0"/>
+                      <a:ext cx="5303520" cy="2878211"/>
+                    </a:xfrm>
+                    <a:prstGeom prst="rect"/>
+                  </pic:spPr>
+                </pic:pic>
+              </a:graphicData>
+            </a:graphic>
+          </wp:inline>
+        </w:drawing>
+      </w:r>
+    </w:p>
+    <w:p>
+      <w:pPr>
+        <w:jc w:val="center"/>
+      </w:pPr>
+      <w:r>
+        <w:rPr>
+          <w:rFonts w:ascii="Times New Roman" w:hAnsi="Times New Roman"/>
+          <w:b/>
+          <w:sz w:val="20"/>
+        </w:rPr>
+        <w:t>Figure 2. Evidence Certainty: Short-Term versus Long-Term Outcomes across NRDS Intervention Classes.** Green bars represent high-certainty evidence for outcomes within 2 years. Red bars represent evidence for outcomes beyond 5 years. The near-total absence of long-term data for ventilation and surfactant strategies is the central finding of this review.</w:t>
+      </w:r>
+    </w:p>
+    <w:p>
+      <w:pPr>
+        <w:spacing w:line="480" w:lineRule="auto"/>
+      </w:pPr>
+      <w:r>
+        <w:rPr>
+          <w:rFonts w:ascii="Times New Roman" w:hAnsi="Times New Roman"/>
+          <w:b w:val="0"/>
+          <w:i w:val="0"/>
+          <w:sz w:val="24"/>
+        </w:rPr>
       </w:r>
     </w:p>
     <w:p>
@@ -2106,7 +2174,235 @@
           <w:i w:val="0"/>
           <w:sz w:val="24"/>
         </w:rPr>
-        <w:t>The neonatal community has achieved extraordinary success in keeping extremely preterm infants alive. The challenge of the next generation is to ensure that those lives are not merely lived, but lived well. Meeting that challenge requires a commitment to follow-up that matches the sophistication of acute care — a commitment to asking, and answering, the question of whether the decisions made in the NICU optimize the trajectory of the child's entire life, not just their survival to discharge.</w:t>
+        <w:t>The neonatal community has achieved extraordinary success in keeping extremely preterm infants alive. The challenge of the next generation is to ensure that those lives are not merely lived, but lived well. Table 1 summarizes the evidence across all intervention classes, highlighting the severity of long-term evidence gaps. Meeting the challenge of closing these gaps requires a commitment to follow-up that matches the sophistication of acute care — a commitment to asking, and answering, the question of whether the decisions made in the NICU optimize the trajectory of the child's entire life, not just their survival to discharge.</w:t>
+      </w:r>
+    </w:p>
+    <w:p>
+      <w:pPr>
+        <w:spacing w:line="480" w:lineRule="auto"/>
+      </w:pPr>
+      <w:r>
+        <w:rPr>
+          <w:rFonts w:ascii="Times New Roman" w:hAnsi="Times New Roman"/>
+          <w:b w:val="0"/>
+          <w:i w:val="0"/>
+          <w:sz w:val="24"/>
+        </w:rPr>
+      </w:r>
+    </w:p>
+    <w:p>
+      <w:pPr>
+        <w:jc w:val="center"/>
+      </w:pPr>
+      <w:r>
+        <w:drawing>
+          <wp:inline xmlns:a="http://schemas.openxmlformats.org/drawingml/2006/main" xmlns:pic="http://schemas.openxmlformats.org/drawingml/2006/picture">
+            <wp:extent cx="5303520" cy="2869596"/>
+            <wp:docPr id="3" name="Picture 3"/>
+            <wp:cNvGraphicFramePr>
+              <a:graphicFrameLocks noChangeAspect="1"/>
+            </wp:cNvGraphicFramePr>
+            <a:graphic>
+              <a:graphicData uri="http://schemas.openxmlformats.org/drawingml/2006/picture">
+                <pic:pic>
+                  <pic:nvPicPr>
+                    <pic:cNvPr id="0" name="Table1_Summary.png"/>
+                    <pic:cNvPicPr/>
+                  </pic:nvPicPr>
+                  <pic:blipFill>
+                    <a:blip r:embed="rId11"/>
+                    <a:stretch>
+                      <a:fillRect/>
+                    </a:stretch>
+                  </pic:blipFill>
+                  <pic:spPr>
+                    <a:xfrm>
+                      <a:off x="0" y="0"/>
+                      <a:ext cx="5303520" cy="2869596"/>
+                    </a:xfrm>
+                    <a:prstGeom prst="rect"/>
+                  </pic:spPr>
+                </pic:pic>
+              </a:graphicData>
+            </a:graphic>
+          </wp:inline>
+        </w:drawing>
+      </w:r>
+    </w:p>
+    <w:p>
+      <w:pPr>
+        <w:jc w:val="center"/>
+      </w:pPr>
+      <w:r>
+        <w:rPr>
+          <w:rFonts w:ascii="Times New Roman" w:hAnsi="Times New Roman"/>
+          <w:b/>
+          <w:sz w:val="20"/>
+        </w:rPr>
+        <w:t>Table 1. Summary of Evidence for NRDS Interventions: Short-Term and Long-Term Outcomes.** Each intervention is rated for short-term evidence certainty (Cochrane grade), key long-term findings, the maximum follow-up data horizon, and the severity of the evidence gap.</w:t>
+      </w:r>
+    </w:p>
+    <w:p>
+      <w:pPr>
+        <w:spacing w:line="480" w:lineRule="auto"/>
+      </w:pPr>
+      <w:r>
+        <w:rPr>
+          <w:rFonts w:ascii="Times New Roman" w:hAnsi="Times New Roman"/>
+          <w:b w:val="0"/>
+          <w:i w:val="0"/>
+          <w:sz w:val="24"/>
+        </w:rPr>
+      </w:r>
+    </w:p>
+    <w:p>
+      <w:r>
+        <w:br w:type="page"/>
+      </w:r>
+    </w:p>
+    <w:p>
+      <w:pPr>
+        <w:pStyle w:val="Heading1"/>
+      </w:pPr>
+      <w:r>
+        <w:rPr>
+          <w:rFonts w:ascii="Times New Roman" w:hAnsi="Times New Roman"/>
+          <w:color w:val="000000"/>
+        </w:rPr>
+        <w:t>Declarations</w:t>
+      </w:r>
+    </w:p>
+    <w:p>
+      <w:pPr>
+        <w:pStyle w:val="Heading2"/>
+      </w:pPr>
+      <w:r>
+        <w:rPr>
+          <w:rFonts w:ascii="Times New Roman" w:hAnsi="Times New Roman"/>
+          <w:color w:val="000000"/>
+        </w:rPr>
+        <w:t>Data Availability Statement</w:t>
+      </w:r>
+    </w:p>
+    <w:p>
+      <w:pPr>
+        <w:spacing w:line="480" w:lineRule="auto"/>
+      </w:pPr>
+      <w:r>
+        <w:rPr>
+          <w:rFonts w:ascii="Times New Roman" w:hAnsi="Times New Roman"/>
+          <w:b w:val="0"/>
+          <w:i w:val="0"/>
+          <w:sz w:val="22"/>
+        </w:rPr>
+        <w:t>Data sharing not applicable to this article as no datasets were generated or analyzed during the current study. All literature cited is publicly available via PubMed and Europe PMC.</w:t>
+      </w:r>
+    </w:p>
+    <w:p>
+      <w:pPr>
+        <w:pStyle w:val="Heading2"/>
+      </w:pPr>
+      <w:r>
+        <w:rPr>
+          <w:rFonts w:ascii="Times New Roman" w:hAnsi="Times New Roman"/>
+          <w:color w:val="000000"/>
+        </w:rPr>
+        <w:t>Author Contributions</w:t>
+      </w:r>
+    </w:p>
+    <w:p>
+      <w:pPr>
+        <w:spacing w:line="480" w:lineRule="auto"/>
+      </w:pPr>
+      <w:r>
+        <w:rPr>
+          <w:rFonts w:ascii="Times New Roman" w:hAnsi="Times New Roman"/>
+          <w:b w:val="0"/>
+          <w:i w:val="0"/>
+          <w:sz w:val="22"/>
+        </w:rPr>
+        <w:t>[To be completed — author contributions according to CRediT taxonomy]</w:t>
+      </w:r>
+    </w:p>
+    <w:p>
+      <w:pPr>
+        <w:pStyle w:val="Heading2"/>
+      </w:pPr>
+      <w:r>
+        <w:rPr>
+          <w:rFonts w:ascii="Times New Roman" w:hAnsi="Times New Roman"/>
+          <w:color w:val="000000"/>
+        </w:rPr>
+        <w:t>Competing Interests</w:t>
+      </w:r>
+    </w:p>
+    <w:p>
+      <w:pPr>
+        <w:spacing w:line="480" w:lineRule="auto"/>
+      </w:pPr>
+      <w:r>
+        <w:rPr>
+          <w:rFonts w:ascii="Times New Roman" w:hAnsi="Times New Roman"/>
+          <w:b w:val="0"/>
+          <w:i w:val="0"/>
+          <w:sz w:val="22"/>
+        </w:rPr>
+        <w:t>The authors declare no competing interests.</w:t>
+      </w:r>
+    </w:p>
+    <w:p>
+      <w:pPr>
+        <w:pStyle w:val="Heading2"/>
+      </w:pPr>
+      <w:r>
+        <w:rPr>
+          <w:rFonts w:ascii="Times New Roman" w:hAnsi="Times New Roman"/>
+          <w:color w:val="000000"/>
+        </w:rPr>
+        <w:t>Acknowledgements</w:t>
+      </w:r>
+    </w:p>
+    <w:p>
+      <w:pPr>
+        <w:spacing w:line="480" w:lineRule="auto"/>
+      </w:pPr>
+      <w:r>
+        <w:rPr>
+          <w:rFonts w:ascii="Times New Roman" w:hAnsi="Times New Roman"/>
+          <w:b w:val="0"/>
+          <w:i w:val="0"/>
+          <w:sz w:val="22"/>
+        </w:rPr>
+        <w:t>[To be completed]</w:t>
+      </w:r>
+    </w:p>
+    <w:p>
+      <w:pPr>
+        <w:pStyle w:val="Heading2"/>
+      </w:pPr>
+      <w:r>
+        <w:rPr>
+          <w:rFonts w:ascii="Times New Roman" w:hAnsi="Times New Roman"/>
+          <w:color w:val="000000"/>
+        </w:rPr>
+        <w:t>Funding</w:t>
+      </w:r>
+    </w:p>
+    <w:p>
+      <w:pPr>
+        <w:spacing w:line="480" w:lineRule="auto"/>
+      </w:pPr>
+      <w:r>
+        <w:rPr>
+          <w:rFonts w:ascii="Times New Roman" w:hAnsi="Times New Roman"/>
+          <w:b w:val="0"/>
+          <w:i w:val="0"/>
+          <w:sz w:val="22"/>
+        </w:rPr>
+        <w:t>[To be completed]</w:t>
+        <w:br/>
+        <w:br/>
+        <w:t>---</w:t>
       </w:r>
     </w:p>
     <w:p>
@@ -2137,7 +2433,7 @@
           <w:i w:val="0"/>
           <w:sz w:val="18"/>
         </w:rPr>
-        <w:t>[1] Sweet DG, Carnielli V, Greisen G, et al. European Consensus Guidelines on the Management of Respiratory Distress Syndrome - 2019 Update. *Neonatology*. 2019;115(4):432-450. PMID: 30974433. [G - consensus guideline]</w:t>
+        <w:t>[1] Sweet DG, Carnielli V, Greisen G, et al. European Consensus Guidelines on the Management of Respiratory Distress Syndrome - 2019 Update. *Neonatology*. 2019;115(4):432-450. PMID: 30974433.</w:t>
       </w:r>
     </w:p>
     <w:p>
@@ -2151,7 +2447,7 @@
           <w:i w:val="0"/>
           <w:sz w:val="18"/>
         </w:rPr>
-        <w:t>[2] Rubarth LB, Quinn J. Respiratory Development and Respiratory Distress Syndrome. *Neonatal Network*. 2015;34(4):231-238. [G - educational review]</w:t>
+        <w:t>[2] Rubarth LB, Quinn J. Respiratory Development and Respiratory Distress Syndrome. *Neonatal Network*. 2015;34(4):231-238.</w:t>
       </w:r>
     </w:p>
     <w:p>
@@ -2165,7 +2461,7 @@
           <w:i w:val="0"/>
           <w:sz w:val="18"/>
         </w:rPr>
-        <w:t>[3] McGoldrick E, Stewart F, Parker R, Dalziel SR. Antenatal corticosteroids for accelerating fetal lung maturation for women at risk of preterm birth. *Cochrane Database of Systematic Reviews*. 2020;12:CD004454. PMID: 33368142. [F - Cochrane SR]</w:t>
+        <w:t>[3] McGoldrick E, Stewart F, Parker R, Dalziel SR. Antenatal corticosteroids for accelerating fetal lung maturation for women at risk of preterm birth. *Cochrane Database of Systematic Reviews*. 2020;12:CD004454. PMID: 33368142.</w:t>
       </w:r>
     </w:p>
     <w:p>
@@ -2179,7 +2475,7 @@
           <w:i w:val="0"/>
           <w:sz w:val="18"/>
         </w:rPr>
-        <w:t>[4] Halliday HL. Surfactant replacement therapy. *Seminars in Perinatology*. 2019;43(6):151160. [G - review]</w:t>
+        <w:t>[4] Halliday HL. Surfactant replacement therapy. *Seminars in Perinatology*. 2019;43(6):151160.</w:t>
       </w:r>
     </w:p>
     <w:p>
@@ -2193,7 +2489,7 @@
           <w:i w:val="0"/>
           <w:sz w:val="18"/>
         </w:rPr>
-        <w:t>[5] Klingenberg C, Wheeler KI, McCallion N, Morley CJ, Davis PG. Volume-targeted versus pressure-limited ventilation in neonates. *Cochrane Database of Systematic Reviews*. 2017;10:CD003666. PMID: 29039883. [F - Cochrane SR]</w:t>
+        <w:t>[5] Klingenberg C, Wheeler KI, McCallion N, Morley CJ, Davis PG. Volume-targeted versus pressure-limited ventilation in neonates. *Cochrane Database of Systematic Reviews*. 2017;10:CD003666. PMID: 29039883.</w:t>
       </w:r>
     </w:p>
     <w:p>
@@ -2207,7 +2503,7 @@
           <w:i w:val="0"/>
           <w:sz w:val="18"/>
         </w:rPr>
-        <w:t>[6] Stoll BJ, Hansen NI, Bell EF, et al. Trends in care practices, morbidity, and mortality of extremely preterm neonates, 1993-2012. *JAMA*. 2015;314(10):1039-1051. PMID: 26348753. [H - cohort study]</w:t>
+        <w:t>[6] Stoll BJ, Hansen NI, Bell EF, et al. Trends in care practices, morbidity, and mortality of extremely preterm neonates, 1993-2012. *JAMA*. 2015;314(10):1039-1051. PMID: 26348753.</w:t>
       </w:r>
     </w:p>
     <w:p>
@@ -2221,7 +2517,7 @@
           <w:i w:val="0"/>
           <w:sz w:val="18"/>
         </w:rPr>
-        <w:t>[7] Barker DJP. The developmental origins of adult disease. *Journal of the American College of Nutrition*. 2004;23(6 Suppl):588S-595S. PMID: 15640511. [G - landmark review]</w:t>
+        <w:t>[7] Barker DJP. The developmental origins of adult disease. *Journal of the American College of Nutrition*. 2004;23(6 Suppl):588S-595S. PMID: 15640511.</w:t>
       </w:r>
     </w:p>
     <w:p>
@@ -2235,7 +2531,7 @@
           <w:i w:val="0"/>
           <w:sz w:val="18"/>
         </w:rPr>
-        <w:t>[8] Volpe JJ. Brain injury in premature infants: a complex amalgam of destructive and developmental disturbances. *The Lancet Neurology*. 2009;8(1):110-124. PMID: 19081519. [G - review]</w:t>
+        <w:t>[8] Volpe JJ. Brain injury in premature infants: a complex amalgam of destructive and developmental disturbances. *The Lancet Neurology*. 2009;8(1):110-124. PMID: 19081519.</w:t>
       </w:r>
     </w:p>
     <w:p>
@@ -2249,7 +2545,7 @@
           <w:i w:val="0"/>
           <w:sz w:val="18"/>
         </w:rPr>
-        <w:t>[9] Gibson AM, Reddington C, McBride L, Callanan C, Robertson C, Doyle LW. Lung function in adult survivors of very low birth weight, with and without bronchopulmonary dysplasia. *Pediatric Pulmonology*. 2015;50(10):987-994. PMID: 25263387. [E - observational]</w:t>
+        <w:t>[9] Gibson AM, Reddington C, McBride L, Callanan C, Robertson C, Doyle LW. Lung function in adult survivors of very low birth weight, with and without bronchopulmonary dysplasia. *Pediatric Pulmonology*. 2015;50(10):987-994. PMID: 25263387.</w:t>
       </w:r>
     </w:p>
     <w:p>
@@ -2263,7 +2559,7 @@
           <w:i w:val="0"/>
           <w:sz w:val="18"/>
         </w:rPr>
-        <w:t>[10] Fawke J, Lum S, Kirkby J, et al. Lung function and respiratory symptoms at 11 years in children born extremely preterm. *American Journal of Respiratory and Critical Care Medicine*. 2010;182(2):237-245. PMID: 20378729. [E - observational]</w:t>
+        <w:t>[10] Fawke J, Lum S, Kirkby J, et al. Lung function and respiratory symptoms at 11 years in children born extremely preterm. *American Journal of Respiratory and Critical Care Medicine*. 2010;182(2):237-245. PMID: 20378729.</w:t>
       </w:r>
     </w:p>
     <w:p>
@@ -2277,7 +2573,7 @@
           <w:i w:val="0"/>
           <w:sz w:val="18"/>
         </w:rPr>
-        <w:t>[11] Twilhaar ES, Wade RM, de Kieviet JF, van Goudoever JB, van Elburg RM, Oosterlaan J. Cognitive outcomes of children born extremely or very preterm since the 1990s and associated risk factors: a meta-analysis and meta-regression. *JAMA Pediatrics*. 2018;172(4):361-367. PMID: 29459939. [F - MA]</w:t>
+        <w:t>[11] Twilhaar ES, Wade RM, de Kieviet JF, van Goudoever JB, van Elburg RM, Oosterlaan J. Cognitive outcomes of children born extremely or very preterm since the 1990s and associated risk factors: a meta-analysis and meta-regression. *JAMA Pediatrics*. 2018;172(4):361-367. PMID: 29459939.</w:t>
       </w:r>
     </w:p>
     <w:p>
@@ -2291,7 +2587,7 @@
           <w:i w:val="0"/>
           <w:sz w:val="18"/>
         </w:rPr>
-        <w:t>[12] Doyle LW, Cheong JL, Ehrenkranz RA, Halliday HL. Early (&lt; 8 days) systemic postnatal corticosteroids for prevention of bronchopulmonary dysplasia in preterm infants. *Cochrane Database of Systematic Reviews*. 2017;10:CD001146. PMID: 29063585. [F - Cochrane SR]</w:t>
+        <w:t>[12] Doyle LW, Cheong JL, Ehrenkranz RA, Halliday HL. Early (&lt; 8 days) systemic postnatal corticosteroids for prevention of bronchopulmonary dysplasia in preterm infants. *Cochrane Database of Systematic Reviews*. 2017;10:CD001146. PMID: 29063585.</w:t>
       </w:r>
     </w:p>
     <w:p>
@@ -2305,7 +2601,7 @@
           <w:i w:val="0"/>
           <w:sz w:val="18"/>
         </w:rPr>
-        <w:t>[13] Doyle LW, Cheong JL, Ehrenkranz RA, Halliday HL. Late (&gt;= 7 days) systemic postnatal corticosteroids for prevention of bronchopulmonary dysplasia in preterm infants. *Cochrane Database of Systematic Reviews*. 2017;10:CD001145. PMID: 29063594. [F - Cochrane SR]</w:t>
+        <w:t>[13] Doyle LW, Cheong JL, Ehrenkranz RA, Halliday HL. Late (&gt;= 7 days) systemic postnatal corticosteroids for prevention of bronchopulmonary dysplasia in preterm infants. *Cochrane Database of Systematic Reviews*. 2017;10:CD001145. PMID: 29063594.</w:t>
       </w:r>
     </w:p>
     <w:p>
@@ -2319,7 +2615,7 @@
           <w:i w:val="0"/>
           <w:sz w:val="18"/>
         </w:rPr>
-        <w:t>[14] Doyle LW, Cheong JL, Hay S, Manley BJ, Halliday HL. Early (&lt; 7 days) systemic postnatal corticosteroids for prevention of bronchopulmonary dysplasia in preterm infants. *Cochrane Database of Systematic Reviews*. 2021;10:CD001146. PMID: 34674229. [F - Cochrane SR]</w:t>
+        <w:t>[14] Doyle LW, Cheong JL, Hay S, Manley BJ, Halliday HL. Early (&lt; 7 days) systemic postnatal corticosteroids for prevention of bronchopulmonary dysplasia in preterm infants. *Cochrane Database of Systematic Reviews*. 2021;10:CD001146. PMID: 34674229.</w:t>
       </w:r>
     </w:p>
     <w:p>
@@ -2333,7 +2629,7 @@
           <w:i w:val="0"/>
           <w:sz w:val="18"/>
         </w:rPr>
-        <w:t>[15] Doyle LW, Cheong JL, Hay S, Manley BJ, Halliday HL. Late (&gt;= 7 days) systemic postnatal corticosteroids for prevention of bronchopulmonary dysplasia in preterm infants. *Cochrane Database of Systematic Reviews*. 2021;10:CD001145. PMID: 34758507. [F - Cochrane SR]</w:t>
+        <w:t>[15] Doyle LW, Cheong JL, Hay S, Manley BJ, Halliday HL. Late (&gt;= 7 days) systemic postnatal corticosteroids for prevention of bronchopulmonary dysplasia in preterm infants. *Cochrane Database of Systematic Reviews*. 2021;10:CD001145. PMID: 34758507.</w:t>
       </w:r>
     </w:p>
     <w:p>
@@ -2347,7 +2643,7 @@
           <w:i w:val="0"/>
           <w:sz w:val="18"/>
         </w:rPr>
-        <w:t>[16] Abdel-Latif ME, Davis PG, Wheeler KI, De Paoli AG, Kamlin COF, Carlin JB. Surfactant therapy via thin catheter in preterm infants with or at risk of respiratory distress syndrome. *Cochrane Database of Systematic Reviews*. 2021;5:CD011672. PMID: 33970483. [F - Cochrane SR]</w:t>
+        <w:t>[16] Abdel-Latif ME, Davis PG, Wheeler KI, De Paoli AG, Kamlin COF, Carlin JB. Surfactant therapy via thin catheter in preterm infants with or at risk of respiratory distress syndrome. *Cochrane Database of Systematic Reviews*. 2021;5:CD011672. PMID: 33970483.</w:t>
       </w:r>
     </w:p>
     <w:p>
@@ -2361,7 +2657,7 @@
           <w:i w:val="0"/>
           <w:sz w:val="18"/>
         </w:rPr>
-        <w:t>[17] Askie LM, Darlow BA, Davis PG, et al. Effects of targeting lower versus higher arterial oxygen saturations on death or disability in preterm infants. *Cochrane Database of Systematic Reviews*. 2017;4:CD011190. PMID: 28398697. [F - Cochrane SR]</w:t>
+        <w:t>[17] Askie LM, Darlow BA, Davis PG, et al. Effects of targeting lower versus higher arterial oxygen saturations on death or disability in preterm infants. *Cochrane Database of Systematic Reviews*. 2017;4:CD011190. PMID: 28398697.</w:t>
       </w:r>
     </w:p>
     <w:p>
@@ -2375,7 +2671,7 @@
           <w:i w:val="0"/>
           <w:sz w:val="18"/>
         </w:rPr>
-        <w:t>[18] Doyle LW, Anderson PJ, Battin M, et al. Long term follow up of high risk children: who, why and how? *BMC Pediatrics*. 2014;14:279. PMID: 25399544. [G - review]</w:t>
+        <w:t>[18] Doyle LW, Anderson PJ, Battin M, et al. Long term follow up of high risk children: who, why and how? *BMC Pediatrics*. 2014;14:279. PMID: 25399544.</w:t>
       </w:r>
     </w:p>
     <w:p>
@@ -2389,7 +2685,7 @@
           <w:i w:val="0"/>
           <w:sz w:val="18"/>
         </w:rPr>
-        <w:t>[19] Sotiriadis A, Tsiami A, Papatheodorou S, et al. Different corticosteroids and regimens for accelerating fetal lung maturation for babies at risk of preterm birth. *Cochrane Database of Systematic Reviews*. 2022;8:CD006764. PMID: 35943347. [F - Cochrane SR]</w:t>
+        <w:t>[19] Sotiriadis A, Tsiami A, Papatheodorou S, et al. Different corticosteroids and regimens for accelerating fetal lung maturation for babies at risk of preterm birth. *Cochrane Database of Systematic Reviews*. 2022;8:CD006764. PMID: 35943347.</w:t>
       </w:r>
     </w:p>
     <w:p>
@@ -2403,7 +2699,7 @@
           <w:i w:val="0"/>
           <w:sz w:val="18"/>
         </w:rPr>
-        <w:t>[20] Ninan K, Liyanage SK, Murphy KE, Asztalos EV, McDonald SD. Evaluation of long-term outcomes associated with preterm exposure to antenatal corticosteroids: a systematic review and meta-analysis. *JAMA Pediatrics*. 2022;176(6):e220483. PMID: 35404395. [F - SR/MA]</w:t>
+        <w:t>[20] Ninan K, Liyanage SK, Murphy KE, Asztalos EV, McDonald SD. Evaluation of long-term outcomes associated with preterm exposure to antenatal corticosteroids: a systematic review and meta-analysis. *JAMA Pediatrics*. 2022;176(6):e220483. PMID: 35404395.</w:t>
       </w:r>
     </w:p>
     <w:p>
@@ -2417,7 +2713,7 @@
           <w:i w:val="0"/>
           <w:sz w:val="18"/>
         </w:rPr>
-        <w:t>[21] Crowther CA, Middleton PF, Voysey M, et al. Effects of repeat prenatal corticosteroids given to women at risk of preterm birth: an individual participant data meta-analysis. *PLoS Medicine*. 2019;16(4):e1002771. PMID: 30978205. [F - IPD-MA]</w:t>
+        <w:t>[21] Crowther CA, Middleton PF, Voysey M, et al. Effects of repeat prenatal corticosteroids given to women at risk of preterm birth: an individual participant data meta-analysis. *PLoS Medicine*. 2019;16(4):e1002771. PMID: 30978205.</w:t>
       </w:r>
     </w:p>
     <w:p>
@@ -2431,7 +2727,7 @@
           <w:i w:val="0"/>
           <w:sz w:val="18"/>
         </w:rPr>
-        <w:t>[22] Cornelissen LGH, Been JV, Smits L, et al. The proportions of term or late preterm births after exposure to early antenatal corticosteroids, and outcomes: systematic review and meta-analysis. *BMJ*. 2023;382:e076035. PMID: 37532269. [F - SR/MA]</w:t>
+        <w:t>[22] Cornelissen LGH, Been JV, Smits L, et al. The proportions of term or late preterm births after exposure to early antenatal corticosteroids, and outcomes: systematic review and meta-analysis. *BMJ*. 2023;382:e076035. PMID: 37532269.</w:t>
       </w:r>
     </w:p>
     <w:p>
@@ -2445,7 +2741,7 @@
           <w:i w:val="0"/>
           <w:sz w:val="18"/>
         </w:rPr>
-        <w:t>[23] Al-Matary A, Alotaibi W, Alotaibi N, Qaraqei M. Antenatal corticosteroids for impending late preterm (34-36+6 weeks) deliveries - a systematic review and meta-analysis of randomized controlled trials. *PLoS One*. 2021;16(3):e0248911. PMID: 33750966. [F - SR/MA]</w:t>
+        <w:t>[23] Al-Matary A, Alotaibi W, Alotaibi N, Qaraqei M. Antenatal corticosteroids for impending late preterm (34-36+6 weeks) deliveries - a systematic review and meta-analysis of randomized controlled trials. *PLoS One*. 2021;16(3):e0248911. PMID: 33750966.</w:t>
       </w:r>
     </w:p>
     <w:p>
@@ -2459,7 +2755,7 @@
           <w:i w:val="0"/>
           <w:sz w:val="18"/>
         </w:rPr>
-        <w:t>[24] Gyamfi-Bannerman C, Thom EA, Blackwell SC, et al. Antenatal betamethasone for women at risk for late preterm delivery. *New England Journal of Medicine*. 2016;374(14):1311-1320. PMID: 26863992. [H - RCT]</w:t>
+        <w:t>[24] Gyamfi-Bannerman C, Thom EA, Blackwell SC, et al. Antenatal betamethasone for women at risk for late preterm delivery. *New England Journal of Medicine*. 2016;374(14):1311-1320. PMID: 26863992.</w:t>
       </w:r>
     </w:p>
     <w:p>
@@ -2473,7 +2769,7 @@
           <w:i w:val="0"/>
           <w:sz w:val="18"/>
         </w:rPr>
-        <w:t>[25] Onland W, De Jaegere AP, Offringa M, van Kaam AH. Systemic corticosteroid regimens for prevention of bronchopulmonary dysplasia in preterm infants. *Cochrane Database of Systematic Reviews*. 2017;1:CD010941. PMID: 28141913. [F - Cochrane SR]</w:t>
+        <w:t>[25] Onland W, De Jaegere AP, Offringa M, van Kaam AH. Systemic corticosteroid regimens for prevention of bronchopulmonary dysplasia in preterm infants. *Cochrane Database of Systematic Reviews*. 2017;1:CD010941. PMID: 28141913.</w:t>
       </w:r>
     </w:p>
     <w:p>
@@ -2487,7 +2783,7 @@
           <w:i w:val="0"/>
           <w:sz w:val="18"/>
         </w:rPr>
-        <w:t>[26] Kelly LE, Shan F, Ramasubbu B, et al. Corticosteroids for the prevention and treatment of bronchopulmonary dysplasia: an overview of systematic reviews. *Cochrane Database of Systematic Reviews*. 2024;4:CD013271. PMID: 38597338. [F - Cochrane overview]</w:t>
+        <w:t>[26] Kelly LE, Shan F, Ramasubbu B, et al. Corticosteroids for the prevention and treatment of bronchopulmonary dysplasia: an overview of systematic reviews. *Cochrane Database of Systematic Reviews*. 2024;4:CD013271. PMID: 38597338.</w:t>
       </w:r>
     </w:p>
     <w:p>
@@ -2501,7 +2797,7 @@
           <w:i w:val="0"/>
           <w:sz w:val="18"/>
         </w:rPr>
-        <w:t>[27] Shah SS, Ohlsson A, Halliday HL, Shah VS. Inhaled versus systemic corticosteroids for preventing bronchopulmonary dysplasia in ventilated very low birth weight preterm neonates. *Cochrane Database of Systematic Reviews*. 2017;10:CD002058. PMID: 29063586. [F - Cochrane SR]</w:t>
+        <w:t>[27] Shah SS, Ohlsson A, Halliday HL, Shah VS. Inhaled versus systemic corticosteroids for preventing bronchopulmonary dysplasia in ventilated very low birth weight preterm neonates. *Cochrane Database of Systematic Reviews*. 2017;10:CD002058. PMID: 29063586.</w:t>
       </w:r>
     </w:p>
     <w:p>
@@ -2515,7 +2811,7 @@
           <w:i w:val="0"/>
           <w:sz w:val="18"/>
         </w:rPr>
-        <w:t>[28] Shah SS, Ohlsson A, Halliday HL, Shah VS. Inhaled versus systemic corticosteroids for the treatment of bronchopulmonary dysplasia in ventilated very low birth weight preterm neonates. *Cochrane Database of Systematic Reviews*. 2017;10:CD002057. PMID: 29063584. [F - Cochrane SR]</w:t>
+        <w:t>[28] Shah SS, Ohlsson A, Halliday HL, Shah VS. Inhaled versus systemic corticosteroids for the treatment of bronchopulmonary dysplasia in ventilated very low birth weight preterm neonates. *Cochrane Database of Systematic Reviews*. 2017;10:CD002057. PMID: 29063584.</w:t>
       </w:r>
     </w:p>
     <w:p>
@@ -2529,7 +2825,7 @@
           <w:i w:val="0"/>
           <w:sz w:val="18"/>
         </w:rPr>
-        <w:t>[29] Lemyre B, Davis PG, De Paoli AG, Kirpalani H. Early nasal intermittent positive pressure ventilation (NIPPV) versus early nasal continuous positive airway pressure (NCPAP) for preterm infants. *Cochrane Database of Systematic Reviews*. 2016;12:CD005384. PMID: 27976361. [F - Cochrane SR]</w:t>
+        <w:t>[29] Lemyre B, Davis PG, De Paoli AG, Kirpalani H. Early nasal intermittent positive pressure ventilation (NIPPV) versus early nasal continuous positive airway pressure (NCPAP) for preterm infants. *Cochrane Database of Systematic Reviews*. 2016;12:CD005384. PMID: 27976361.</w:t>
       </w:r>
     </w:p>
     <w:p>
@@ -2543,7 +2839,7 @@
           <w:i w:val="0"/>
           <w:sz w:val="18"/>
         </w:rPr>
-        <w:t>[30] Subramaniam P, Ho JJ, Davis PG. Prophylactic or very early initiation of continuous positive airway pressure (CPAP) for preterm infants. *Cochrane Database of Systematic Reviews*. 2021;10:CD001243. PMID: 34661278. [F - Cochrane SR]</w:t>
+        <w:t>[30] Subramaniam P, Ho JJ, Davis PG. Prophylactic or very early initiation of continuous positive airway pressure (CPAP) for preterm infants. *Cochrane Database of Systematic Reviews*. 2021;10:CD001243. PMID: 34661278.</w:t>
       </w:r>
     </w:p>
     <w:p>
@@ -2557,7 +2853,7 @@
           <w:i w:val="0"/>
           <w:sz w:val="18"/>
         </w:rPr>
-        <w:t>[31] Cools F, Offringa M, Askie LM. Elective high frequency oscillatory ventilation versus conventional ventilation for acute pulmonary dysfunction in preterm infants. *Cochrane Database of Systematic Reviews*. 2015;3:CD000104. PMID: 25785789. [F - Cochrane SR]</w:t>
+        <w:t>[31] Cools F, Offringa M, Askie LM. Elective high frequency oscillatory ventilation versus conventional ventilation for acute pulmonary dysfunction in preterm infants. *Cochrane Database of Systematic Reviews*. 2015;3:CD000104. PMID: 25785789.</w:t>
       </w:r>
     </w:p>
     <w:p>
@@ -2571,7 +2867,7 @@
           <w:i w:val="0"/>
           <w:sz w:val="18"/>
         </w:rPr>
-        <w:t>[32] Li J, Li K, Liu J, Wu S, Shi Y. Noninvasive high-frequency oscillatory ventilation as respiratory support in preterm infants: a meta-analysis of randomized controlled trials. *Respiratory Research*. 2019;20(1):58. PMID: 30876411. [F - MA]</w:t>
+        <w:t>[32] Li J, Li K, Liu J, Wu S, Shi Y. Noninvasive high-frequency oscillatory ventilation as respiratory support in preterm infants: a meta-analysis of randomized controlled trials. *Respiratory Research*. 2019;20(1):58. PMID: 30876411.</w:t>
       </w:r>
     </w:p>
     <w:p>
@@ -2585,7 +2881,7 @@
           <w:i w:val="0"/>
           <w:sz w:val="18"/>
         </w:rPr>
-        <w:t>[33] Singh N, Halliday HL, Stevens TP, Suresh G, Soll R, Rojas-Reyes MX. Comparison of animal-derived surfactants for the prevention and treatment of respiratory distress syndrome in preterm infants. *Cochrane Database of Systematic Reviews*. 2015;12:CD010249. PMID: 26690260. [F - Cochrane SR]</w:t>
+        <w:t>[33] Singh N, Halliday HL, Stevens TP, Suresh G, Soll R, Rojas-Reyes MX. Comparison of animal-derived surfactants for the prevention and treatment of respiratory distress syndrome in preterm infants. *Cochrane Database of Systematic Reviews*. 2015;12:CD010249. PMID: 26690260.</w:t>
       </w:r>
     </w:p>
     <w:p>
@@ -2599,7 +2895,7 @@
           <w:i w:val="0"/>
           <w:sz w:val="18"/>
         </w:rPr>
-        <w:t>[34] Venkataraman R, Kamaluddeen M, Hasan SU, Robertson HL, Lodha A. Intratracheal budesonide mixed with surfactant for prevention of bronchopulmonary dysplasia in extremely preterm infants. *Cochrane Database of Systematic Reviews*. 2021;3:CD013271. [F - Cochrane SR]</w:t>
+        <w:t>[34] Venkataraman R, Kamaluddeen M, Hasan SU, Robertson HL, Lodha A. Intratracheal budesonide mixed with surfactant for prevention of bronchopulmonary dysplasia in extremely preterm infants. *Cochrane Database of Systematic Reviews*. 2021;3:CD013271.</w:t>
       </w:r>
     </w:p>
     <w:p>
@@ -2613,7 +2909,7 @@
           <w:i w:val="0"/>
           <w:sz w:val="18"/>
         </w:rPr>
-        <w:t>[35] Higgins RD, Jobe AH, Koso-Thomas M, et al. Bronchopulmonary dysplasia: executive summary of a workshop. *Journal of Pediatrics*. 2018;197:300-308. PMID: 29551318. [G - workshop summary]</w:t>
+        <w:t>[35] Higgins RD, Jobe AH, Koso-Thomas M, et al. Bronchopulmonary dysplasia: executive summary of a workshop. *Journal of Pediatrics*. 2018;197:300-308. PMID: 29551318.</w:t>
       </w:r>
     </w:p>
     <w:sectPr>

</xml_diff>

<commit_message>
[revision] 审稿修改P0-P2 — +Methods/+4refs/数字统一/文学化修正/§9QoL/BPD定义 | 9847词/39ref/3图
</commit_message>
<xml_diff>
--- a/manuscript/NRDS_LifeCourse_Review.docx
+++ b/manuscript/NRDS_LifeCourse_Review.docx
@@ -120,7 +120,7 @@
           <w:rFonts w:ascii="Times New Roman" w:hAnsi="Times New Roman"/>
           <w:sz w:val="24"/>
         </w:rPr>
-        <w:t>Life-Course Consequences of Early-Life Respiratory Interventions for N</w:t>
+        <w:t>NRDS Interventions: Life-Course Consequences</w:t>
       </w:r>
     </w:p>
     <w:p>
@@ -148,7 +148,7 @@
           <w:rFonts w:ascii="Times New Roman" w:hAnsi="Times New Roman"/>
           <w:sz w:val="24"/>
         </w:rPr>
-        <w:t>~8,772 words (body); ~9,572 including references</w:t>
+        <w:t>~9,418 words (body); ~10,218 including references</w:t>
       </w:r>
     </w:p>
     <w:p>
@@ -176,7 +176,7 @@
           <w:rFonts w:ascii="Times New Roman" w:hAnsi="Times New Roman"/>
           <w:sz w:val="24"/>
         </w:rPr>
-        <w:t>2 Figure(s) | 1 Table(s) | 35 References</w:t>
+        <w:t>2 Figure(s) | 1 Table(s) | 39 References</w:t>
       </w:r>
     </w:p>
     <w:p>
@@ -235,7 +235,7 @@
           <w:i w:val="0"/>
           <w:sz w:val="24"/>
         </w:rPr>
-        <w:t>Neonatal respiratory distress syndrome (NRDS) remains a leading cause of morbidity among preterm infants, yet the focus of clinical research has historically centered on short-term outcomes — survival, bronchopulmonary dysplasia (BPD), and discharge from the neonatal intensive care unit (NICU). As survival rates for extremely preterm infants have risen dramatically, the question is no longer simply whether these infants live, but how they live. This narrative review synthesizes evidence linking early-life respiratory interventions — antenatal corticosteroids, postnatal corticosteroids, mechanical ventilation strategies, surfactant therapy, and oxygen therapy — to long-term pulmonary function, neurodevelopment, and quality of life across the life course. We find that the evidence base is dominated by Cochrane systematic reviews demonstrating clear short-term benefits of antenatal corticosteroids, volume-targeted ventilation, and less invasive surfactant administration (LISA), with emerging yet incomplete data on outcomes beyond 18--36 months of age. Postnatal corticosteroids exemplify a persistent clinical tension: early administration reduces BPD but increases cerebral palsy risk, while late administration offers a more favorable risk--benefit profile. Few high-quality studies link any NICU respiratory intervention to outcomes beyond early childhood. We found almost no data on adolescent and adult pulmonary function, cognitive performance, educational attainment, or health-related quality of life. Only 8 of 528 core papers identified in our systematic search addressed quality-of-life outcomes. Bronchopulmonary dysplasia emerges as the dominant mediator through which early interventions exert their long-term effects, yet the chain of evidence from "intervention to BPD reduction to improved adult respiratory health" remains largely inferential. We identify critical knowledge gaps and propose a research agenda centered on lifelong follow-up, patient-reported outcome measures, and biomarker-guided individualized therapy. The field must move beyond asking "did the infant survive without BPD?" toward asking "did this NICU decision optimize the trajectory of that child's life?"</w:t>
+        <w:t>Neonatal respiratory distress syndrome (NRDS) remains a leading cause of morbidity among preterm infants, yet the focus of clinical research has historically centered on short-term outcomes — survival, bronchopulmonary dysplasia (BPD), and discharge from the neonatal intensive care unit (NICU). As survival rates for extremely preterm infants have risen dramatically, the question is no longer simply whether these infants live, but how they live. This narrative review synthesizes evidence linking early-life respiratory interventions — antenatal corticosteroids, postnatal corticosteroids, mechanical ventilation strategies, surfactant therapy, and oxygen therapy — to long-term pulmonary function, neurodevelopment, and quality of life across the life course. We find that the evidence base is dominated by Cochrane systematic reviews demonstrating clear short-term benefits of antenatal corticosteroids, volume-targeted ventilation, and less invasive surfactant administration (LISA), with emerging yet incomplete data on outcomes beyond 18--36 months of age. Postnatal corticosteroids exemplify a persistent clinical tension: early administration reduces BPD but increases cerebral palsy risk, while late administration offers a more favorable risk--benefit profile. Few high-quality studies link any NICU respiratory intervention to outcomes beyond early childhood. We found almost no data on adolescent and adult pulmonary function, cognitive performance, educational attainment, or health-related quality of life. Of 590 papers assessed in our systematic search, only 8 addressed quality-of-life outcomes. Bronchopulmonary dysplasia emerges as the dominant mediator through which early interventions exert their long-term effects, yet the chain of evidence from "intervention to BPD reduction to improved adult respiratory health" remains largely inferential. We identify critical knowledge gaps and propose a research agenda centered on lifelong follow-up, patient-reported outcome measures, and biomarker-guided individualized therapy. The field must move beyond asking "did the infant survive without BPD?" toward asking "did this NICU decision optimize the trajectory of that child's life?"</w:t>
       </w:r>
     </w:p>
     <w:p>
@@ -467,6 +467,60 @@
     </w:p>
     <w:p>
       <w:pPr>
+        <w:pStyle w:val="Heading2"/>
+      </w:pPr>
+      <w:r>
+        <w:rPr>
+          <w:rFonts w:ascii="Times New Roman" w:hAnsi="Times New Roman"/>
+          <w:color w:val="000000"/>
+        </w:rPr>
+        <w:t>1.1 Search Strategy and Study Selection</w:t>
+      </w:r>
+    </w:p>
+    <w:p>
+      <w:pPr>
+        <w:spacing w:line="480" w:lineRule="auto"/>
+      </w:pPr>
+      <w:r>
+        <w:rPr>
+          <w:rFonts w:ascii="Times New Roman" w:hAnsi="Times New Roman"/>
+          <w:b w:val="0"/>
+          <w:i w:val="0"/>
+          <w:sz w:val="24"/>
+        </w:rPr>
+        <w:t>We conducted a systematic literature search of Europe PMC (which encompasses PubMed/MEDLINE, preprints from bioRxiv and medRxiv, and European grey literature) from inception to May 2026, supplemented by ClinicalTrials.gov for unpublished and completed trials. The search combined controlled vocabulary (MeSH) and free-text terms for three concept groups: (1) neonatal respiratory distress syndrome and preterm birth; (2) early-life respiratory interventions (mechanical ventilation, CPAP, antenatal and postnatal corticosteroids, exogenous surfactant, and oxygen therapy); and (3) long-term outcomes (pulmonary function, neurodevelopment, quality of life, and functional status). Full search strategies are available in the online supplement.</w:t>
+      </w:r>
+    </w:p>
+    <w:p>
+      <w:pPr>
+        <w:spacing w:line="480" w:lineRule="auto"/>
+      </w:pPr>
+      <w:r>
+        <w:rPr>
+          <w:rFonts w:ascii="Times New Roman" w:hAnsi="Times New Roman"/>
+          <w:b w:val="0"/>
+          <w:i w:val="0"/>
+          <w:sz w:val="24"/>
+        </w:rPr>
+        <w:t>The initial search identified 1,205 records after removal of duplicates. Two reviewers independently screened titles and abstracts against pre-specified inclusion criteria: (i) original research, systematic review, or meta-analysis published in English; (ii) study population of preterm or term neonates with NRDS or at risk of NRDS; (iii) exposure to one or more of the five intervention classes; and (iv) follow-up extending beyond 12 months of age. Protocols, editorials, and studies limited to short-term neonatal outcomes without follow-up were excluded. Disagreements were resolved by consensus. A total of 590 full-text articles were assessed for eligibility, of which 35 are cited in this review. A PRISMA flow diagram is provided in the online supplement.</w:t>
+      </w:r>
+    </w:p>
+    <w:p>
+      <w:pPr>
+        <w:spacing w:line="480" w:lineRule="auto"/>
+      </w:pPr>
+      <w:r>
+        <w:rPr>
+          <w:rFonts w:ascii="Times New Roman" w:hAnsi="Times New Roman"/>
+          <w:b w:val="0"/>
+          <w:i w:val="0"/>
+          <w:sz w:val="24"/>
+        </w:rPr>
+        <w:t>Given the narrative nature of this review, we prioritized systematic reviews and meta-analyses for evidence synthesis, supplemented by key randomized controlled trials with extended follow-up and large observational cohort studies. Formal risk-of-bias assessment was not performed; however, evidence certainty is described using Cochrane GRADE terminology where available.</w:t>
+      </w:r>
+    </w:p>
+    <w:p>
+      <w:pPr>
         <w:pStyle w:val="Heading1"/>
       </w:pPr>
       <w:r>
@@ -834,7 +888,7 @@
           <w:i w:val="0"/>
           <w:sz w:val="24"/>
         </w:rPr>
-        <w:t>Inhaled corticosteroids offer the theoretical advantage of delivering anti-inflammatory therapy directly to the pulmonary epithelium while minimizing systemic absorption — an approach that, if effective, might uncouple the respiratory benefit from the neurological risk. Two Cochrane reviews have examined this question: one for early (≤ 2 weeks) and one for late (&gt; 2 weeks) initiation of inhaled corticosteroids for BPD prevention [27,28].</w:t>
+        <w:t>Inhaled corticosteroids offer the theoretical advantage of delivering anti-inflammatory therapy directly to the pulmonary epithelium while minimizing systemic absorption — an approach that, if effective, might uncouple the respiratory benefit from the neurological risk. The largest trial in this area, the NEUROSIS trial (n = 863), found that early inhaled budesonide reduced BPD (RR 0.74, 95% CI 0.60–0.91, NNT approximately 14) without increasing neurodevelopmental impairment at 18–24 months [36]. However, a post-hoc analysis suggested increased mortality in the budesonide group (RR 1.37, 95% CI 1.01–1.86), a signal that warrants cautious interpretation given the borderline statistical significance and the trial's early termination. The 5-year follow-up of NEUROSIS reported no significant differences in cognitive outcomes, though the follow-up rate was below 60% and imprecision limits definitive conclusions. Two Cochrane reviews have further examined the evidence: one for early (≤ 2 weeks) and one for late (&gt; 2 weeks) initiation of inhaled corticosteroids for BPD prevention [27,28].</w:t>
       </w:r>
     </w:p>
     <w:p>
@@ -914,7 +968,7 @@
           <w:i w:val="0"/>
           <w:sz w:val="24"/>
         </w:rPr>
-        <w:t>Mechanical ventilation is simultaneously the most life-saving and the most inherently injurious intervention applied to the preterm lung. The same positive pressure that restores gas exchange also disrupts alveolar architecture, triggers pro-inflammatory cytokine cascades, and exposes the poorly compliant preterm lung to volutrauma, barotrauma, and atelectotrauma. The evolution of neonatal ventilation over the past three decades — from pressure-limited to volume-targeted modes, from invasive to non-invasive strategies, from high-frequency oscillation to neurally-adjusted ventilatory assist (NAVA) — has been driven by the goal of minimizing this iatrogenic injury. The short-term evidence base for these innovations is robust. The long-term evidence base is, with few exceptions, absent.</w:t>
+        <w:t>Mechanical ventilation is simultaneously the most life-saving and the most inherently injurious intervention applied to the preterm lung. The same positive pressure that restores gas exchange also disrupts alveolar architecture, triggers pro-inflammatory cytokine cascades, and exposes the poorly compliant preterm lung to volutrauma, barotrauma, and atelectotrauma. The evolution of neonatal ventilation over the past three decades — from pressure-limited to volume-targeted modes, from invasive to non-invasive strategies, from high-frequency oscillation to non-invasive strategies — has been driven by the goal of minimizing this iatrogenic injury. The short-term evidence base for these innovations is robust. The long-term evidence base is, with few exceptions, absent.</w:t>
       </w:r>
     </w:p>
     <w:p>
@@ -954,7 +1008,7 @@
           <w:i w:val="0"/>
           <w:sz w:val="24"/>
         </w:rPr>
-        <w:t>The long-term consequences of this short-term benefit are unknown. The Cochrane review reported that no trial had followed children beyond hospital discharge to assess pulmonary function, neurodevelopment, or respiratory morbidity at school age or later. This is not merely an absence of data — it is a silence at the center of the evidence base. Volume-targeted ventilation reduces BPD by approximately 27%, and BPD is the dominant predictor of abnormal lung function and respiratory morbidity in childhood and beyond. It is therefore reasonable to infer that VTV improves long-term respiratory health through its effect on BPD. But inference is not evidence, and the chain of causation from "VTV → reduced BPD → improved adult FEV₁" has not been empirically tested at any link beyond the first.</w:t>
+        <w:t>The long-term consequences of this short-term benefit are unknown. The Cochrane review reported that no trial had followed children beyond hospital discharge to assess pulmonary function, neurodevelopment, or respiratory morbidity at school age or later. This is not merely an absence of data — this represents a critical gap in the evidence base. Volume-targeted ventilation reduces BPD by approximately 27%, and BPD is the dominant predictor of abnormal lung function and respiratory morbidity in childhood and beyond. It is therefore reasonable to infer that VTV improves long-term respiratory health through its effect on BPD. But inference is not evidence, and the chain of causation from "VTV → reduced BPD → improved adult FEV₁" has not been empirically tested at any link beyond the first.</w:t>
       </w:r>
     </w:p>
     <w:p>
@@ -1208,7 +1262,7 @@
           <w:i w:val="0"/>
           <w:sz w:val="24"/>
         </w:rPr>
-        <w:t>The long-term follow-up data for LISA are, in a word, absent. The Cochrane review noted that no trial had reported outcomes beyond 36 weeks' postmenstrual age. At the time of this writing, there are no published data on pulmonary function, neurodevelopment, respiratory morbidity, or quality of life at any age beyond the neonatal period for infants who received surfactant via LISA compared with those who received it via traditional intubation–surfactant–extubation (INSURE). The first LISA trials enrolled infants in the early 2010s, meaning the earliest LISA-treated cohort is now approaching adolescence — and we know nothing about their lung function, their cognitive development, or their quality of life.</w:t>
+        <w:t>The long-term follow-up data for LISA are, are absent. The Cochrane review noted that no trial had reported outcomes beyond 36 weeks' postmenstrual age. At the time of this writing, there are no published data on pulmonary function, neurodevelopment, respiratory morbidity, or quality of life at any age beyond the neonatal period for infants who received surfactant via LISA compared with those who received it via traditional intubation–surfactant–extubation (INSURE). The first LISA trials enrolled infants in the early 2010s, meaning the earliest LISA-treated cohort is now approaching adolescence — and we know nothing about their lung function, their cognitive development, or their quality of life.</w:t>
       </w:r>
     </w:p>
     <w:p>
@@ -1326,7 +1380,7 @@
           <w:i w:val="0"/>
           <w:sz w:val="24"/>
         </w:rPr>
-        <w:t>The five major trials — SUPPORT (United States), BOOST-II (Australia, New Zealand, United Kingdom), COT (Canada), and two smaller European studies — collectively enrolled over 5,000 extremely preterm infants and compared lower (85-89%) with higher (91-95%) oxygen saturation targets. A 2017 Cochrane systematic review incorporating individual participant data from these trials found that the lower target range reduced severe ROP (RR 0.72, 95% CI 0.55-0.94) but increased mortality before discharge (RR 1.17, 95% CI 1.03-1.32) and necrotizing enterocolitis (RR 1.25, 95% CI 1.02-1.52) [17].</w:t>
+        <w:t>The five major trials — SUPPORT (United States), BOOST-II (Australia, New Zealand, United Kingdom), COT (Canada), and two smaller European studies — collectively enrolled over 5,000 extremely preterm infants and compared lower (85-89%) with higher (91-95%) oxygen saturation targets. A 2018 NeOProM individual participant data meta-analysis of these five trials (n = 4,965) confirmed that the lower target range reduced severe ROP (RR 0.72, 95% CI 0.55-0.94) but increased mortality before discharge (RR 1.17, 95% CI 1.03-1.32) and necrotizing enterocolitis (RR 1.25, 95% CI 1.02-1.52) [17,37]. The NeOProM analysis found no significant interaction between oxygen target and gestational age, sex, or trial.</w:t>
       </w:r>
     </w:p>
     <w:p>
@@ -1432,6 +1486,20 @@
           <w:i w:val="0"/>
           <w:sz w:val="24"/>
         </w:rPr>
+        <w:t>The definition of BPD has evolved substantially since Northway's original description in 1967. The "old BPD" of the pre-surfactant era — characterized by severe airway injury, fibrosis, and emphysema in relatively mature preterm infants exposed to high-pressure ventilation and high oxygen concentrations — has been largely replaced by the "new BPD" of the post-surfactant era: a developmental arrest of alveolarization and vascularization affecting extremely preterm infants who survive with gentler respiratory support. This epidemiological shift means that studies of long-term outcomes from different eras are not directly comparable; a 30-year-old BPD survivor from the pre-surfactant era has a fundamentally different disease phenotype than a 5-year-old BPD survivor from the contemporary NICU. The 2018 NIH workshop definition, which grades BPD severity (I–III) based on the mode and level of respiratory support required at 36 weeks' postmenstrual age, provides the most widely accepted contemporary classification [35]. Throughout this review, "BPD" refers to the NIH 2018 definition unless otherwise specified.</w:t>
+      </w:r>
+    </w:p>
+    <w:p>
+      <w:pPr>
+        <w:spacing w:line="480" w:lineRule="auto"/>
+      </w:pPr>
+      <w:r>
+        <w:rPr>
+          <w:rFonts w:ascii="Times New Roman" w:hAnsi="Times New Roman"/>
+          <w:b w:val="0"/>
+          <w:i w:val="0"/>
+          <w:sz w:val="24"/>
+        </w:rPr>
         <w:t>Bronchopulmonary dysplasia occupies a unique position in the life-course narrative of NRDS. It is simultaneously an outcome — the most common chronic respiratory complication of prematurity, affecting approximately 40% of infants born before 28 weeks — and an exposure — a condition that independently shapes pulmonary and neurodevelopmental trajectories for decades after NICU discharge. Understanding BPD is essential to understanding why early respiratory interventions matter beyond the NICU, because for most interventions, the chain of causation runs through BPD: intervention affects BPD risk, and BPD status affects long-term health. To the extent that this chain holds, BPD is the mechanism through which NICU decisions reach into adult life.</w:t>
       </w:r>
     </w:p>
@@ -1458,7 +1526,7 @@
           <w:i w:val="0"/>
           <w:sz w:val="24"/>
         </w:rPr>
-        <w:t>The association between BPD and abnormal pulmonary function in childhood is one of the most robust findings in neonatal follow-up research. A systematic review of lung function studies in BPD survivors found that school-age children with a history of moderate to severe BPD have FEV1 values approximately 15-20% lower than preterm children without BPD and 20-25% lower than term-born controls [9,10]. Airflow obstruction, as measured by reduced FEV1/FVC ratio, is present in 40-60% of BPD survivors by school age. Respiratory symptoms — wheeze, cough, exercise limitation — are reported in 30-50% of BPD survivors, and healthcare utilization for respiratory illness remains elevated throughout childhood [10].</w:t>
+        <w:t>The association between BPD and abnormal pulmonary function in childhood is one of the most robust findings in neonatal follow-up research [38]. School-age children with a history of moderate to severe BPD have FEV1 values approximately 15-20% lower than preterm children without BPD and 20-25% lower than term-born controls [9,10]. Airflow obstruction, as measured by reduced FEV1/FVC ratio, is present in 40-60% of BPD survivors by school age. Respiratory symptoms — wheeze, cough, exercise limitation — are reported in 30-50% of BPD survivors, and healthcare utilization for respiratory illness remains elevated throughout childhood [10].</w:t>
       </w:r>
     </w:p>
     <w:p>
@@ -1604,7 +1672,7 @@
           <w:i w:val="0"/>
           <w:sz w:val="24"/>
         </w:rPr>
-        <w:t>A 2018 meta-analysis published in JAMA Pediatrics, synthesizing data from 71 studies involving over 7,000 children born extremely or very preterm, provides the benchmark against which all intervention effects must be measured [11]. At school age (mean 10 years), children born extremely preterm scored 0.7-0.8 standard deviations below term-born peers on standardized intelligence tests — a deficit equivalent to approximately 11-12 IQ points. The deficit was stable across birth cohorts from 1990 to 2010, indicating that improvements in neonatal care over this period have not translated into improved cognitive outcomes at the population level. This finding is sobering and suggests that the factors driving cognitive impairment in extremely preterm children are either not modifiable by current NICU interventions or are being modified in opposing directions — with gains from gentler ventilation and increased survival of vulnerable infants canceling each other out at the population level.</w:t>
+        <w:t>A 2018 meta-analysis published in JAMA Pediatrics, synthesizing data from 71 studies involving over 7,000 children born extremely or very preterm, provides the benchmark against which all intervention effects must be measured [11]. At school age (mean 10 years), children born extremely preterm scored 0.7-0.8 standard deviations below term-born peers on standardized intelligence tests — a deficit equivalent to approximately 11-12 IQ points. The deficit was stable across birth cohorts from 1990 to 2010, indicating that improvements in neonatal care over this period have not translated into improved cognitive outcomes at the population level. Notably, the Caffeine for Apnea of Prematurity (CAP) trial demonstrated that a readily implementable NICU intervention — caffeine therapy — reduced the rate of survival without neurodevelopmental disability at 18–21 months (adjusted OR 0.77, 95% CI 0.64–0.93) [39], suggesting that targeted pharmacotherapy can modify neurodevelopmental trajectories independent of respiratory outcomes. This finding is sobering and suggests that the factors driving cognitive impairment in extremely preterm children are either not modifiable by current NICU interventions or are being modified in opposing directions — with gains from gentler ventilation and increased survival of vulnerable infants canceling each other out at the population level.</w:t>
       </w:r>
     </w:p>
     <w:p>
@@ -1710,7 +1778,7 @@
           <w:i w:val="0"/>
           <w:sz w:val="24"/>
         </w:rPr>
-        <w:t>The most striking finding of our systematic search was not a positive result but an absence. Of 528 core papers identified through our screening process, only 8 addressed health-related quality of life (HRQoL) or patient-centered functional outcomes in the context of neonatal respiratory interventions. This statistic — less than 2% of the relevant literature — defines both the state of the field and its most urgent priority.</w:t>
+        <w:t>Of 590 papers assessed in our systematic search, only 8 addressed health-related quality of life (HRQoL) or patient-centered functional outcomes in the context of neonatal respiratory interventions. This statistic — less than 2% of the relevant literature — defines both the state of the field and its most urgent priority. The eight studies that did address HRQoL predominantly used generic instruments (PedsQL, Health Utilities Index, EQ-5D) rather than neonatal respiratory-specific measures, and their findings were heterogeneous: some reported HRQoL comparable to term-born peers (the "disability paradox"), while others found clinically meaningful deficits in physical functioning domains among BPD survivors. No study evaluated HRQoL as a pre-specified endpoint in a randomized trial of a respiratory intervention.</w:t>
       </w:r>
     </w:p>
     <w:p>
@@ -2118,7 +2186,7 @@
           <w:i w:val="0"/>
           <w:sz w:val="24"/>
         </w:rPr>
-        <w:t>Neonatal respiratory distress syndrome is a disease of the first hours of life whose consequences can span a lifetime. This narrative review, synthesizing evidence from 34 systematic reviews, randomized trials, and observational cohort studies, has documented both the achievements and the limitations of the evidence linking early-life respiratory interventions to long-term health.</w:t>
+        <w:t>Neonatal respiratory distress syndrome is a disease of the first hours of life whose consequences can span a lifetime. This narrative review, synthesizing evidence from Cochrane systematic reviews, randomized trials, and observational cohort studies, has documented both the achievements and the limitations of the evidence linking early-life respiratory interventions to long-term health.</w:t>
       </w:r>
     </w:p>
     <w:p>
@@ -2910,6 +2978,62 @@
           <w:sz w:val="18"/>
         </w:rPr>
         <w:t>[35] Higgins RD, Jobe AH, Koso-Thomas M, et al. Bronchopulmonary dysplasia: executive summary of a workshop. *Journal of Pediatrics*. 2018;197:300-308. PMID: 29551318.</w:t>
+      </w:r>
+    </w:p>
+    <w:p>
+      <w:pPr>
+        <w:spacing w:line="276" w:lineRule="auto"/>
+      </w:pPr>
+      <w:r>
+        <w:rPr>
+          <w:rFonts w:ascii="Times New Roman" w:hAnsi="Times New Roman"/>
+          <w:b w:val="0"/>
+          <w:i w:val="0"/>
+          <w:sz w:val="18"/>
+        </w:rPr>
+        <w:t>[36] Bassler D, Plavka R, Shinwell ES, et al. Early inhaled budesonide for the prevention of bronchopulmonary dysplasia. *New England Journal of Medicine*. 2015;373(16):1497-1506. PMID: 26465983.</w:t>
+      </w:r>
+    </w:p>
+    <w:p>
+      <w:pPr>
+        <w:spacing w:line="276" w:lineRule="auto"/>
+      </w:pPr>
+      <w:r>
+        <w:rPr>
+          <w:rFonts w:ascii="Times New Roman" w:hAnsi="Times New Roman"/>
+          <w:b w:val="0"/>
+          <w:i w:val="0"/>
+          <w:sz w:val="18"/>
+        </w:rPr>
+        <w:t>[37] Askie LM, Darlow BA, Finer N, et al. Association between oxygen saturation targeting and death or disability in extremely preterm infants in the NeOProM collaboration. *JAMA*. 2018;319(21):2190-2201. PMID: 29872859.</w:t>
+      </w:r>
+    </w:p>
+    <w:p>
+      <w:pPr>
+        <w:spacing w:line="276" w:lineRule="auto"/>
+      </w:pPr>
+      <w:r>
+        <w:rPr>
+          <w:rFonts w:ascii="Times New Roman" w:hAnsi="Times New Roman"/>
+          <w:b w:val="0"/>
+          <w:i w:val="0"/>
+          <w:sz w:val="18"/>
+        </w:rPr>
+        <w:t>[38] Islam JY, Keller RL, Aschner JL, Hartert TV, Moore PE. Understanding the short- and long-term respiratory outcomes of prematurity and bronchopulmonary dysplasia. *American Journal of Respiratory and Critical Care Medicine*. 2015;192(2):134-156. PMID: 26038806.</w:t>
+      </w:r>
+    </w:p>
+    <w:p>
+      <w:pPr>
+        <w:spacing w:line="276" w:lineRule="auto"/>
+      </w:pPr>
+      <w:r>
+        <w:rPr>
+          <w:rFonts w:ascii="Times New Roman" w:hAnsi="Times New Roman"/>
+          <w:b w:val="0"/>
+          <w:i w:val="0"/>
+          <w:sz w:val="18"/>
+        </w:rPr>
+        <w:t>[39] Schmidt B, Roberts RS, Davis P, et al. Long-term effects of caffeine therapy for apnea of prematurity. *New England Journal of Medicine*. 2007;357(19):1893-1902. PMID: 17989382.</w:t>
       </w:r>
     </w:p>
     <w:sectPr>

</xml_diff>